<commit_message>
Add Jupyter notebook for preparing and training content-based recommendation model
</commit_message>
<xml_diff>
--- a/Task 2/Task2_Sentiment_Analysis_Report.docx
+++ b/Task 2/Task2_Sentiment_Analysis_Report.docx
@@ -6,7 +6,6 @@
       <w:pPr>
         <w:pStyle w:val="Title"/>
         <w:spacing w:after="100"/>
-        <w:jc w:val="center"/>
         <w:rPr>
           <w:b/>
           <w:bCs/>
@@ -77,37 +76,85 @@
         <w:spacing w:after="160"/>
         <w:jc w:val="center"/>
       </w:pPr>
+      <w:proofErr w:type="spellStart"/>
       <w:r>
         <w:rPr>
           <w:i/>
           <w:iCs/>
           <w:color w:val="555555"/>
         </w:rPr>
-        <w:t xml:space="preserve">Redg. No. INBT021871  |  </w:t>
-      </w:r>
+        <w:t>Redg</w:t>
+      </w:r>
+      <w:proofErr w:type="spellEnd"/>
       <w:r>
         <w:rPr>
           <w:i/>
           <w:iCs/>
           <w:color w:val="555555"/>
         </w:rPr>
-        <w:t>Course ID: AIINB1</w:t>
-      </w:r>
+        <w:t>. No. INBT</w:t>
+      </w:r>
+      <w:proofErr w:type="gramStart"/>
       <w:r>
         <w:rPr>
           <w:i/>
           <w:iCs/>
           <w:color w:val="555555"/>
         </w:rPr>
-        <w:t>0726</w:t>
-      </w:r>
+        <w:t>021871  |</w:t>
+      </w:r>
+      <w:proofErr w:type="gramEnd"/>
       <w:r>
         <w:rPr>
           <w:i/>
           <w:iCs/>
           <w:color w:val="555555"/>
         </w:rPr>
-        <w:t xml:space="preserve">   |   Prepared by:Avni Shukla</w:t>
+        <w:t xml:space="preserve">  </w:t>
+      </w:r>
+      <w:r>
+        <w:rPr>
+          <w:i/>
+          <w:iCs/>
+          <w:color w:val="555555"/>
+        </w:rPr>
+        <w:t>Course ID: AIINB1</w:t>
+      </w:r>
+      <w:r>
+        <w:rPr>
+          <w:i/>
+          <w:iCs/>
+          <w:color w:val="555555"/>
+        </w:rPr>
+        <w:t>0726</w:t>
+      </w:r>
+      <w:r>
+        <w:rPr>
+          <w:i/>
+          <w:iCs/>
+          <w:color w:val="555555"/>
+        </w:rPr>
+        <w:t xml:space="preserve">   |   Prepared </w:t>
+      </w:r>
+      <w:proofErr w:type="spellStart"/>
+      <w:proofErr w:type="gramStart"/>
+      <w:r>
+        <w:rPr>
+          <w:i/>
+          <w:iCs/>
+          <w:color w:val="555555"/>
+        </w:rPr>
+        <w:t>by:Avni</w:t>
+      </w:r>
+      <w:proofErr w:type="spellEnd"/>
+      <w:proofErr w:type="gramEnd"/>
+      <w:r>
+        <w:rPr>
+          <w:i/>
+          <w:iCs/>
+          <w:color w:val="555555"/>
+        </w:rPr>
+        <w:t xml:space="preserve"> Shukla</w:t>
       </w:r>
     </w:p>
     <w:p>
@@ -200,7 +247,17 @@
         <w:spacing w:after="80"/>
       </w:pPr>
       <w:r>
-        <w:t>Punctuation removal — all punctuation characters stripped using Python's string.punctuation table.</w:t>
+        <w:t xml:space="preserve">Punctuation removal — all punctuation characters stripped using Python's </w:t>
+      </w:r>
+      <w:proofErr w:type="spellStart"/>
+      <w:proofErr w:type="gramStart"/>
+      <w:r>
+        <w:t>string.punctuation</w:t>
+      </w:r>
+      <w:proofErr w:type="spellEnd"/>
+      <w:proofErr w:type="gramEnd"/>
+      <w:r>
+        <w:t xml:space="preserve"> table.</w:t>
       </w:r>
     </w:p>
     <w:p>
@@ -256,7 +313,23 @@
         <w:spacing w:after="160"/>
       </w:pPr>
       <w:r>
-        <w:t>Cleaned text is split into individual word tokens using NLTK's word_tokenize, which handles punctuation-aware splitting more reliably than a plain .split().</w:t>
+        <w:t xml:space="preserve">Cleaned text is split into individual word tokens using NLTK's </w:t>
+      </w:r>
+      <w:proofErr w:type="spellStart"/>
+      <w:r>
+        <w:t>word_tokenize</w:t>
+      </w:r>
+      <w:proofErr w:type="spellEnd"/>
+      <w:r>
+        <w:t xml:space="preserve">, which handles punctuation-aware splitting more reliably than a </w:t>
+      </w:r>
+      <w:proofErr w:type="gramStart"/>
+      <w:r>
+        <w:t>plain .split</w:t>
+      </w:r>
+      <w:proofErr w:type="gramEnd"/>
+      <w:r>
+        <w:t>().</w:t>
       </w:r>
     </w:p>
     <w:p>
@@ -265,7 +338,15 @@
         <w:spacing w:before="250" w:after="120"/>
       </w:pPr>
       <w:r>
-        <w:t>2.3 Stopword Removal</w:t>
+        <w:t xml:space="preserve">2.3 </w:t>
+      </w:r>
+      <w:proofErr w:type="spellStart"/>
+      <w:r>
+        <w:t>Stopword</w:t>
+      </w:r>
+      <w:proofErr w:type="spellEnd"/>
+      <w:r>
+        <w:t xml:space="preserve"> Removal</w:t>
       </w:r>
     </w:p>
     <w:p>
@@ -273,7 +354,23 @@
         <w:spacing w:after="160"/>
       </w:pPr>
       <w:r>
-        <w:t>Common English stopwords (from NLTK's stopword corpus, e.g. "the", "is", "and") are removed from the token list, since they carry little sentiment-discriminating information. The remaining tokens are re-joined into the final cleaned text used for feature extraction.</w:t>
+        <w:t xml:space="preserve">Common English </w:t>
+      </w:r>
+      <w:proofErr w:type="spellStart"/>
+      <w:r>
+        <w:t>stopwords</w:t>
+      </w:r>
+      <w:proofErr w:type="spellEnd"/>
+      <w:r>
+        <w:t xml:space="preserve"> (from NLTK's </w:t>
+      </w:r>
+      <w:proofErr w:type="spellStart"/>
+      <w:r>
+        <w:t>stopword</w:t>
+      </w:r>
+      <w:proofErr w:type="spellEnd"/>
+      <w:r>
+        <w:t xml:space="preserve"> corpus, e.g. "the", "is", "and") are removed from the token list, since they carry little sentiment-discriminating information. The remaining tokens are re-joined into the final cleaned text used for feature extraction.</w:t>
       </w:r>
     </w:p>
     <w:p>
@@ -290,7 +387,15 @@
         <w:spacing w:after="160"/>
       </w:pPr>
       <w:r>
-        <w:t>Before modeling, the class distribution of the emotion labels is computed and plotted. Because the dataset is imbalanced across emotion classes, macro-averaged F1-score (rather than raw accuracy) is used as the primary metric throughout Part A and Part B, since it weights all classes equally regardless of their size.</w:t>
+        <w:t xml:space="preserve">Before </w:t>
+      </w:r>
+      <w:proofErr w:type="spellStart"/>
+      <w:r>
+        <w:t>modeling</w:t>
+      </w:r>
+      <w:proofErr w:type="spellEnd"/>
+      <w:r>
+        <w:t>, the class distribution of the emotion labels is computed and plotted. Because the dataset is imbalanced across emotion classes, macro-averaged F1-score (rather than raw accuracy) is used as the primary metric throughout Part A and Part B, since it weights all classes equally regardless of their size.</w:t>
       </w:r>
     </w:p>
     <w:p>
@@ -308,7 +413,31 @@
       </w:pPr>
       <w:r>
         <w:lastRenderedPageBreak/>
-        <w:t>A single train_test_split call with test_size=0.20, random_state=42, and stratification by label is used to create the train/test sets. This exact split is reused unchanged for TF-IDF (Logistic Regression, SVM) and for the LSTM, so all three models are evaluated on identical, comparable data.</w:t>
+        <w:t xml:space="preserve">A single </w:t>
+      </w:r>
+      <w:proofErr w:type="spellStart"/>
+      <w:r>
+        <w:t>train_test_split</w:t>
+      </w:r>
+      <w:proofErr w:type="spellEnd"/>
+      <w:r>
+        <w:t xml:space="preserve"> call with </w:t>
+      </w:r>
+      <w:proofErr w:type="spellStart"/>
+      <w:r>
+        <w:t>test_size</w:t>
+      </w:r>
+      <w:proofErr w:type="spellEnd"/>
+      <w:r>
+        <w:t xml:space="preserve">=0.20, </w:t>
+      </w:r>
+      <w:proofErr w:type="spellStart"/>
+      <w:r>
+        <w:t>random_state</w:t>
+      </w:r>
+      <w:proofErr w:type="spellEnd"/>
+      <w:r>
+        <w:t>=42, and stratification by label is used to create the train/test sets. This exact split is reused unchanged for TF-IDF (Logistic Regression, SVM) and for the LSTM, so all three models are evaluated on identical, comparable data.</w:t>
       </w:r>
     </w:p>
     <w:p>
@@ -643,7 +772,15 @@
           </w:tcPr>
           <w:p>
             <w:r>
-              <w:t>SVM (LinearSVC)</w:t>
+              <w:t>SVM (</w:t>
+            </w:r>
+            <w:proofErr w:type="spellStart"/>
+            <w:r>
+              <w:t>LinearSVC</w:t>
+            </w:r>
+            <w:proofErr w:type="spellEnd"/>
+            <w:r>
+              <w:t>)</w:t>
             </w:r>
           </w:p>
         </w:tc>
@@ -1061,18 +1198,28 @@
         <w:pStyle w:val="Heading2"/>
         <w:spacing w:before="250" w:after="120"/>
       </w:pPr>
+      <w:proofErr w:type="gramStart"/>
       <w:r>
         <w:t xml:space="preserve">6.4  </w:t>
       </w:r>
       <w:r>
-        <w:t xml:space="preserve">Why </w:t>
-      </w:r>
-      <w:r>
-        <w:t xml:space="preserve">LSTM Did Not Beat the Classical Models </w:t>
+        <w:t>Why</w:t>
+      </w:r>
+      <w:proofErr w:type="gramEnd"/>
+      <w:r>
+        <w:t xml:space="preserve"> </w:t>
+      </w:r>
+      <w:r>
+        <w:t xml:space="preserve">LSTM Did Not Beat the Classical </w:t>
+      </w:r>
+      <w:proofErr w:type="gramStart"/>
+      <w:r>
+        <w:t xml:space="preserve">Models </w:t>
       </w:r>
       <w:r>
         <w:t>?</w:t>
       </w:r>
+      <w:proofErr w:type="gramEnd"/>
     </w:p>
     <w:p>
       <w:pPr>
@@ -1111,7 +1258,15 @@
         <w:t>Short, simple text:</w:t>
       </w:r>
       <w:r>
-        <w:t xml:space="preserve"> emotion-labelled sentences here tend to be short and lexically direct (a few strongly emotion-indicative words are usually enough), so the extra sequence-modeling capacity of an LSTM may not pay off.</w:t>
+        <w:t xml:space="preserve"> emotion-labelled sentences here tend to be short and lexically direct (a few strongly emotion-indicative words are usually enough), so the extra sequence-</w:t>
+      </w:r>
+      <w:proofErr w:type="spellStart"/>
+      <w:r>
+        <w:t>modeling</w:t>
+      </w:r>
+      <w:proofErr w:type="spellEnd"/>
+      <w:r>
+        <w:t xml:space="preserve"> capacity of an LSTM may not pay off.</w:t>
       </w:r>
     </w:p>
     <w:p>
@@ -1151,13 +1306,26 @@
         <w:t>Insufficient data for deep learning to show its advantage:</w:t>
       </w:r>
       <w:r>
-        <w:t xml:space="preserve"> the theoretical strength of LSTMs </w:t>
+        <w:t xml:space="preserve"> the theoretical strength of </w:t>
+      </w:r>
+      <w:proofErr w:type="gramStart"/>
+      <w:r>
+        <w:t xml:space="preserve">LSTMs </w:t>
       </w:r>
       <w:r>
         <w:t>,</w:t>
       </w:r>
-      <w:r>
-        <w:t xml:space="preserve"> modeling long-range dependencies and word order — pays off most on longer, more syntactically complex text; on short, single-sentence inputs that advantage shrinks.</w:t>
+      <w:proofErr w:type="gramEnd"/>
+      <w:r>
+        <w:t xml:space="preserve"> </w:t>
+      </w:r>
+      <w:proofErr w:type="spellStart"/>
+      <w:r>
+        <w:t>modeling</w:t>
+      </w:r>
+      <w:proofErr w:type="spellEnd"/>
+      <w:r>
+        <w:t xml:space="preserve"> long-range dependencies and word order — pays off most on longer, more syntactically complex text; on short, single-sentence inputs that advantage shrinks.</w:t>
       </w:r>
     </w:p>
     <w:p>
@@ -1171,7 +1339,37 @@
           <w:i/>
           <w:iCs/>
         </w:rPr>
-        <w:t>Recognizing when a simpler model wins is a key data-science skill</w:t>
+        <w:t xml:space="preserve">Recognizing when a </w:t>
+      </w:r>
+      <w:proofErr w:type="gramStart"/>
+      <w:r>
+        <w:rPr>
+          <w:b/>
+          <w:bCs/>
+          <w:i/>
+          <w:iCs/>
+        </w:rPr>
+        <w:t>simpler model wins</w:t>
+      </w:r>
+      <w:proofErr w:type="gramEnd"/>
+      <w:r>
+        <w:rPr>
+          <w:b/>
+          <w:bCs/>
+          <w:i/>
+          <w:iCs/>
+        </w:rPr>
+        <w:t xml:space="preserve"> is a key data-science </w:t>
+      </w:r>
+      <w:proofErr w:type="gramStart"/>
+      <w:r>
+        <w:rPr>
+          <w:b/>
+          <w:bCs/>
+          <w:i/>
+          <w:iCs/>
+        </w:rPr>
+        <w:t>skill</w:t>
       </w:r>
       <w:r>
         <w:t xml:space="preserve"> </w:t>
@@ -1179,6 +1377,7 @@
       <w:r>
         <w:t>,</w:t>
       </w:r>
+      <w:proofErr w:type="gramEnd"/>
       <w:r>
         <w:t xml:space="preserve"> it is a valid, reportable outcome if the classical models match or beat the LSTM here, and does not indicate a flawed implementation.</w:t>
       </w:r>
@@ -1310,7 +1509,23 @@
           <w:b/>
           <w:bCs/>
         </w:rPr>
-        <w:t>Classical Model SVM with F1 score : 0.8527.</w:t>
+        <w:t xml:space="preserve">Classical Model SVM with F1 </w:t>
+      </w:r>
+      <w:proofErr w:type="gramStart"/>
+      <w:r>
+        <w:rPr>
+          <w:b/>
+          <w:bCs/>
+        </w:rPr>
+        <w:t>score :</w:t>
+      </w:r>
+      <w:proofErr w:type="gramEnd"/>
+      <w:r>
+        <w:rPr>
+          <w:b/>
+          <w:bCs/>
+        </w:rPr>
+        <w:t xml:space="preserve"> 0.8527.</w:t>
       </w:r>
     </w:p>
     <w:sectPr>

</xml_diff>